<commit_message>
Switch Lucero letter client to Shea's Haven Project, Inc.
- Client is now the corporation (registered with the AZ Corporation
  Commission); Tom signs as officer (Title: President)
- Recipient block: Shea's Haven Project, Inc. / Attn: Joseph T. Lucero,
  President; same address; 'Dear Tom' greeting retained
- Neutralized two scope references that assumed the property/account sit
  in the living trust, since the property/bank titling vs. the corporation
  is an open cleanup item

Co-Authored-By: Claude Opus 4.8 <noreply@anthropic.com>
Claude-Session: https://claude.ai/code/session_01RfN2m1kgBo1xCWLXRNw2zV
</commit_message>
<xml_diff>
--- a/Onyx_Engagement_Letter_Lucero_HOURLY.docx
+++ b/Onyx_Engagement_Letter_Lucero_HOURLY.docx
@@ -245,7 +245,7 @@
           <w:noProof/>
           <w:color w:val="auto"/>
         </w:rPr>
-        <w:t>Joseph Thomas Lucero</w:t>
+        <w:t>Shea’s Haven Project, Inc.</w:t>
       </w:r>
       <w:r>
         <w:rPr>
@@ -474,10 +474,19 @@
         <w:rPr>
           <w:noProof/>
         </w:rPr>
-        <w:t>Joseph Thomas Lucero</w:t>
+        <w:t>Shea’s Haven Project, Inc.</w:t>
       </w:r>
       <w:r>
         <w:fldChar w:fldCharType="end"/>
+      </w:r>
+      <w:bookmarkEnd w:id="2"/>
+    </w:p>
+    <w:p>
+      <w:pPr>
+        <w:pStyle w:val="CLALTRAddressorSignature"/>
+      </w:pPr>
+      <w:r>
+        <w:t>Attn: Joseph T. Lucero, President</w:t>
       </w:r>
       <w:bookmarkEnd w:id="2"/>
     </w:p>
@@ -611,7 +620,7 @@
         <w:rPr>
           <w:noProof/>
         </w:rPr>
-        <w:t>Joseph Thomas Lucero</w:t>
+        <w:t>Shea’s Haven Project, Inc.</w:t>
       </w:r>
       <w:r>
         <w:fldChar w:fldCharType="end"/>
@@ -837,7 +846,7 @@
       </w:pPr>
       <w:r>
         <w:rPr/>
-        <w:t>ONYX will set up your rental property — a single furnished rental held in The Joseph Thomas Lucero Living Trust, which you refer to as “Shea Haven” — in QuickBooks Online and get the books clean and current from the property’s May 2026 in-service date — then hand you a documented, largely automated process you can run yourself. The work is scoped to this single furnished (30-day-plus) rental, managed by your property-management company, and can be adjusted as your needs change.</w:t>
+        <w:t>ONYX will set up your rental property in QuickBooks Online and get the books clean and current from the property’s May 2026 in-service date — then hand you a documented, largely automated process you can run yourself. The work is scoped to this single furnished (30-day-plus) rental, managed by your property-management company, and can be adjusted as your needs change.</w:t>
       </w:r>
     </w:p>
     <w:p>
@@ -887,7 +896,7 @@
       </w:pPr>
       <w:r>
         <w:rPr/>
-        <w:t>Set up your rental property in QuickBooks Online — chart of accounts and the trust’s rental bank account — structured for a furnished, 30-day-plus rental.</w:t>
+        <w:t>Set up your rental property in QuickBooks Online — chart of accounts and the rental bank account — structured for a furnished, 30-day-plus rental.</w:t>
       </w:r>
     </w:p>
     <w:p>
@@ -929,7 +938,7 @@
       </w:pPr>
       <w:r>
         <w:rPr/>
-        <w:t>Capture direct property expenses paid from the trust account (for example, utilities) and expenses you pay personally, recorded as owner contributions, so every deductible cost is credited to the property.</w:t>
+        <w:t>Capture direct property expenses paid from the rental account (for example, utilities) and expenses you pay personally, recorded as owner contributions, so every deductible cost is credited to the property.</w:t>
       </w:r>
     </w:p>
     <w:p>
@@ -3715,37 +3724,7 @@
         <w:pStyle w:val="CLALTRNormal"/>
       </w:pPr>
       <w:r>
-        <w:t xml:space="preserve">This letter correctly sets forth the understanding of </w:t>
-      </w:r>
-      <w:r>
-        <w:fldChar w:fldCharType="begin">
-          <w:ffData>
-            <w:name w:val="Text46"/>
-            <w:enabled/>
-            <w:calcOnExit w:val="0"/>
-            <w:textInput>
-              <w:default w:val="[Client Name]"/>
-            </w:textInput>
-          </w:ffData>
-        </w:fldChar>
-      </w:r>
-      <w:r>
-        <w:instrText xml:space="preserve"> FORMTEXT </w:instrText>
-      </w:r>
-      <w:r>
-        <w:fldChar w:fldCharType="separate"/>
-      </w:r>
-      <w:r>
-        <w:rPr>
-          <w:noProof/>
-        </w:rPr>
-        <w:t>Joseph Thomas Lucero</w:t>
-      </w:r>
-      <w:r>
-        <w:fldChar w:fldCharType="end"/>
-      </w:r>
-      <w:r>
-        <w:t>.</w:t>
+        <w:t>This letter correctly sets forth the understanding of Shea’s Haven Project, Inc.</w:t>
       </w:r>
     </w:p>
     <w:p>
@@ -3820,73 +3799,7 @@
         <w:pStyle w:val="CLALTRNormal"/>
       </w:pPr>
       <w:r>
-        <w:t xml:space="preserve">Title: </w:t>
-      </w:r>
-      <w:r>
-        <w:rPr>
-          <w:u w:val="single"/>
-        </w:rPr>
-        <w:tab/>
-      </w:r>
-      <w:r>
-        <w:rPr>
-          <w:u w:val="single"/>
-        </w:rPr>
-        <w:tab/>
-      </w:r>
-      <w:r>
-        <w:rPr>
-          <w:u w:val="single"/>
-        </w:rPr>
-        <w:tab/>
-      </w:r>
-      <w:r>
-        <w:rPr>
-          <w:u w:val="single"/>
-        </w:rPr>
-        <w:tab/>
-      </w:r>
-      <w:r>
-        <w:rPr>
-          <w:u w:val="single"/>
-        </w:rPr>
-        <w:tab/>
-      </w:r>
-      <w:r>
-        <w:rPr>
-          <w:u w:val="single"/>
-        </w:rPr>
-        <w:tab/>
-      </w:r>
-      <w:r>
-        <w:rPr>
-          <w:u w:val="single"/>
-        </w:rPr>
-        <w:tab/>
-      </w:r>
-      <w:r>
-        <w:rPr>
-          <w:u w:val="single"/>
-        </w:rPr>
-        <w:tab/>
-      </w:r>
-      <w:r>
-        <w:rPr>
-          <w:u w:val="single"/>
-        </w:rPr>
-        <w:tab/>
-      </w:r>
-      <w:r>
-        <w:rPr>
-          <w:u w:val="single"/>
-        </w:rPr>
-        <w:tab/>
-      </w:r>
-      <w:r>
-        <w:rPr>
-          <w:u w:val="single"/>
-        </w:rPr>
-        <w:tab/>
+        <w:t>Title:  President</w:t>
       </w:r>
     </w:p>
     <w:p>

</xml_diff>

<commit_message>
Retarget Lucero letter to the living trust per Steven
Client is now The Joseph Thomas Lucero Living Trust dtd 01/18/2024; Tom
signs as Trustee. Recipient block, opening, response line, and signer
title updated; address and 'Dear Tom' greeting unchanged. (QB entity
naming is a separate matter Steven will handle with the client.)

Co-Authored-By: Claude Opus 4.8 <noreply@anthropic.com>
Claude-Session: https://claude.ai/code/session_01RfN2m1kgBo1xCWLXRNw2zV
</commit_message>
<xml_diff>
--- a/Onyx_Engagement_Letter_Lucero_HOURLY.docx
+++ b/Onyx_Engagement_Letter_Lucero_HOURLY.docx
@@ -245,7 +245,7 @@
           <w:noProof/>
           <w:color w:val="auto"/>
         </w:rPr>
-        <w:t>Shea’s Haven Project, Inc.</w:t>
+        <w:t>The Joseph Thomas Lucero Living Trust dtd 01/18/2024</w:t>
       </w:r>
       <w:r>
         <w:rPr>
@@ -474,7 +474,7 @@
         <w:rPr>
           <w:noProof/>
         </w:rPr>
-        <w:t>Shea’s Haven Project, Inc.</w:t>
+        <w:t>The Joseph Thomas Lucero Living Trust dtd 01/18/2024</w:t>
       </w:r>
       <w:r>
         <w:fldChar w:fldCharType="end"/>
@@ -486,7 +486,7 @@
         <w:pStyle w:val="CLALTRAddressorSignature"/>
       </w:pPr>
       <w:r>
-        <w:t>Attn: Joseph T. Lucero, President</w:t>
+        <w:t>Attn: Joseph T. Lucero, Trustee</w:t>
       </w:r>
       <w:bookmarkEnd w:id="2"/>
     </w:p>
@@ -620,7 +620,7 @@
         <w:rPr>
           <w:noProof/>
         </w:rPr>
-        <w:t>Shea’s Haven Project, Inc.</w:t>
+        <w:t>The Joseph Thomas Lucero Living Trust dtd 01/18/2024</w:t>
       </w:r>
       <w:r>
         <w:fldChar w:fldCharType="end"/>
@@ -3724,7 +3724,7 @@
         <w:pStyle w:val="CLALTRNormal"/>
       </w:pPr>
       <w:r>
-        <w:t>This letter correctly sets forth the understanding of Shea’s Haven Project, Inc.</w:t>
+        <w:t>This letter correctly sets forth the understanding of The Joseph Thomas Lucero Living Trust dtd 01/18/2024.</w:t>
       </w:r>
     </w:p>
     <w:p>
@@ -3799,7 +3799,7 @@
         <w:pStyle w:val="CLALTRNormal"/>
       </w:pPr>
       <w:r>
-        <w:t>Title:  President</w:t>
+        <w:t>Title:  Trustee</w:t>
       </w:r>
     </w:p>
     <w:p>

</xml_diff>

<commit_message>
Flatten form fields to plain text in Lucero letter
Converts the 12 legacy form fields (client name, dates, work-product
phrase, etc.) to plain text so Word's gray field shading no longer
appears. Text is unchanged; only the retainer remains as an editable
placeholder.

Co-Authored-By: Claude Opus 4.8 <noreply@anthropic.com>
Claude-Session: https://claude.ai/code/session_01RfN2m1kgBo1xCWLXRNw2zV
</commit_message>
<xml_diff>
--- a/Onyx_Engagement_Letter_Lucero_HOURLY.docx
+++ b/Onyx_Engagement_Letter_Lucero_HOURLY.docx
@@ -158,31 +158,10 @@
         </w:rPr>
       </w:pPr>
       <w:r>
-        <w:fldChar w:fldCharType="begin">
-          <w:ffData>
-            <w:name w:val=""/>
-            <w:enabled/>
-            <w:calcOnExit w:val="0"/>
-            <w:textInput>
-              <w:default w:val="[Date of letter]"/>
-            </w:textInput>
-          </w:ffData>
-        </w:fldChar>
-      </w:r>
-      <w:r>
-        <w:instrText xml:space="preserve"> FORMTEXT </w:instrText>
-      </w:r>
-      <w:r>
-        <w:fldChar w:fldCharType="separate"/>
-      </w:r>
-      <w:r>
         <w:rPr>
           <w:noProof/>
         </w:rPr>
         <w:t>September 15, 2026</w:t>
-      </w:r>
-      <w:r>
-        <w:fldChar w:fldCharType="end"/>
       </w:r>
     </w:p>
     <w:p>
@@ -207,38 +186,11 @@
           <w:color w:val="660003"/>
         </w:rPr>
       </w:pPr>
+      <w:bookmarkStart w:id="0" w:name="Text1"/>
       <w:r>
         <w:rPr>
           <w:color w:val="auto"/>
         </w:rPr>
-        <w:fldChar w:fldCharType="begin">
-          <w:ffData>
-            <w:name w:val="Text1"/>
-            <w:enabled/>
-            <w:calcOnExit w:val="0"/>
-            <w:textInput>
-              <w:default w:val="[Client Name]"/>
-            </w:textInput>
-          </w:ffData>
-        </w:fldChar>
-      </w:r>
-      <w:bookmarkStart w:id="0" w:name="Text1"/>
-      <w:r>
-        <w:rPr>
-          <w:color w:val="auto"/>
-        </w:rPr>
-        <w:instrText xml:space="preserve"> FORMTEXT </w:instrText>
-      </w:r>
-      <w:r>
-        <w:rPr>
-          <w:color w:val="auto"/>
-        </w:rPr>
-      </w:r>
-      <w:r>
-        <w:rPr>
-          <w:color w:val="auto"/>
-        </w:rPr>
-        <w:fldChar w:fldCharType="separate"/>
       </w:r>
       <w:r>
         <w:rPr>
@@ -246,12 +198,6 @@
           <w:color w:val="auto"/>
         </w:rPr>
         <w:t>The Joseph Thomas Lucero Living Trust dtd 01/18/2024</w:t>
-      </w:r>
-      <w:r>
-        <w:rPr>
-          <w:color w:val="auto"/>
-        </w:rPr>
-        <w:fldChar w:fldCharType="end"/>
       </w:r>
       <w:bookmarkEnd w:id="0"/>
     </w:p>
@@ -421,63 +367,21 @@
         <w:pStyle w:val="CLALTRNormal"/>
       </w:pPr>
       <w:r>
-        <w:fldChar w:fldCharType="begin">
-          <w:ffData>
-            <w:name w:val="Text25"/>
-            <w:enabled/>
-            <w:calcOnExit w:val="0"/>
-            <w:textInput>
-              <w:default w:val="[Date]"/>
-            </w:textInput>
-          </w:ffData>
-        </w:fldChar>
-      </w:r>
-      <w:r>
-        <w:instrText xml:space="preserve"> FORMTEXT </w:instrText>
-      </w:r>
-      <w:r>
-        <w:fldChar w:fldCharType="separate"/>
-      </w:r>
-      <w:r>
         <w:rPr>
           <w:noProof/>
         </w:rPr>
         <w:t>September 15, 2026</w:t>
       </w:r>
-      <w:r>
-        <w:fldChar w:fldCharType="end"/>
-      </w:r>
     </w:p>
     <w:p>
       <w:pPr>
         <w:pStyle w:val="CLALTRAddressorSignature"/>
       </w:pPr>
       <w:r>
-        <w:fldChar w:fldCharType="begin">
-          <w:ffData>
-            <w:name w:val="Text46"/>
-            <w:enabled/>
-            <w:calcOnExit w:val="0"/>
-            <w:textInput>
-              <w:default w:val="[Client Name]"/>
-            </w:textInput>
-          </w:ffData>
-        </w:fldChar>
-      </w:r>
-      <w:r>
-        <w:instrText xml:space="preserve"> FORMTEXT </w:instrText>
-      </w:r>
-      <w:r>
-        <w:fldChar w:fldCharType="separate"/>
-      </w:r>
-      <w:r>
         <w:rPr>
           <w:noProof/>
         </w:rPr>
         <w:t>The Joseph Thomas Lucero Living Trust dtd 01/18/2024</w:t>
-      </w:r>
-      <w:r>
-        <w:fldChar w:fldCharType="end"/>
       </w:r>
       <w:bookmarkEnd w:id="2"/>
     </w:p>
@@ -524,34 +428,13 @@
       <w:r>
         <w:t xml:space="preserve">Dear </w:t>
       </w:r>
-      <w:r>
-        <w:fldChar w:fldCharType="begin">
-          <w:ffData>
-            <w:name w:val="Text22"/>
-            <w:enabled/>
-            <w:calcOnExit w:val="0"/>
-            <w:textInput>
-              <w:default w:val="[Salutation]"/>
-            </w:textInput>
-          </w:ffData>
-        </w:fldChar>
-      </w:r>
       <w:bookmarkStart w:id="5" w:name="Text22"/>
       <w:r>
-        <w:instrText xml:space="preserve"> FORMTEXT </w:instrText>
-      </w:r>
-      <w:r>
-        <w:fldChar w:fldCharType="separate"/>
-      </w:r>
-      <w:r>
         <w:rPr>
           <w:noProof/>
         </w:rPr>
         <w:t>Tom</w:t>
       </w:r>
-      <w:r>
-        <w:fldChar w:fldCharType="end"/>
-      </w:r>
       <w:bookmarkEnd w:id="5"/>
       <w:r>
         <w:t>:</w:t>
@@ -599,33 +482,12 @@
         <w:t xml:space="preserve"> will provide for </w:t>
       </w:r>
       <w:r>
-        <w:fldChar w:fldCharType="begin">
-          <w:ffData>
-            <w:name w:val="Text46"/>
-            <w:enabled/>
-            <w:calcOnExit w:val="0"/>
-            <w:textInput>
-              <w:default w:val="[Client Name]"/>
-            </w:textInput>
-          </w:ffData>
-        </w:fldChar>
-      </w:r>
-      <w:r>
-        <w:instrText xml:space="preserve"> FORMTEXT </w:instrText>
-      </w:r>
-      <w:r>
-        <w:fldChar w:fldCharType="separate"/>
-      </w:r>
-      <w:r>
         <w:rPr>
           <w:noProof/>
         </w:rPr>
         <w:t>The Joseph Thomas Lucero Living Trust dtd 01/18/2024</w:t>
       </w:r>
       <w:r>
-        <w:fldChar w:fldCharType="end"/>
-      </w:r>
-      <w:r>
         <w:t xml:space="preserve"> (“</w:t>
       </w:r>
       <w:r>
@@ -647,33 +509,12 @@
         <w:t xml:space="preserve">starting in </w:t>
       </w:r>
       <w:r>
-        <w:fldChar w:fldCharType="begin">
-          <w:ffData>
-            <w:name w:val="Text27"/>
-            <w:enabled/>
-            <w:calcOnExit w:val="0"/>
-            <w:textInput>
-              <w:default w:val="[period OR year]"/>
-            </w:textInput>
-          </w:ffData>
-        </w:fldChar>
-      </w:r>
-      <w:r>
-        <w:instrText xml:space="preserve"> FORMTEXT </w:instrText>
-      </w:r>
-      <w:r>
-        <w:fldChar w:fldCharType="separate"/>
-      </w:r>
-      <w:r>
         <w:rPr>
           <w:noProof/>
         </w:rPr>
         <w:t>May 2026</w:t>
       </w:r>
       <w:r>
-        <w:fldChar w:fldCharType="end"/>
-      </w:r>
-      <w:r>
         <w:t xml:space="preserve"> </w:t>
       </w:r>
       <w:r>
@@ -693,31 +534,10 @@
       </w:r>
       <w:bookmarkStart w:id="6" w:name="Text47"/>
       <w:r>
-        <w:fldChar w:fldCharType="begin">
-          <w:ffData>
-            <w:name w:val="Text47"/>
-            <w:enabled/>
-            <w:calcOnExit w:val="0"/>
-            <w:textInput>
-              <w:default w:val="[Year-end Date]"/>
-            </w:textInput>
-          </w:ffData>
-        </w:fldChar>
-      </w:r>
-      <w:r>
-        <w:instrText xml:space="preserve"> FORMTEXT </w:instrText>
-      </w:r>
-      <w:r>
-        <w:fldChar w:fldCharType="separate"/>
-      </w:r>
-      <w:r>
         <w:rPr>
           <w:noProof/>
         </w:rPr>
         <w:t>December 31, 2026</w:t>
-      </w:r>
-      <w:r>
-        <w:fldChar w:fldCharType="end"/>
       </w:r>
       <w:bookmarkEnd w:id="6"/>
       <w:r>
@@ -1140,31 +960,10 @@
         <w:t xml:space="preserve">Billing rates guaranteed through </w:t>
       </w:r>
       <w:r>
-        <w:fldChar w:fldCharType="begin">
-          <w:ffData>
-            <w:name w:val="Text30"/>
-            <w:enabled/>
-            <w:calcOnExit w:val="0"/>
-            <w:textInput>
-              <w:default w:val="[Insert date]"/>
-            </w:textInput>
-          </w:ffData>
-        </w:fldChar>
-      </w:r>
-      <w:r>
-        <w:instrText xml:space="preserve"> FORMTEXT </w:instrText>
-      </w:r>
-      <w:r>
-        <w:fldChar w:fldCharType="separate"/>
-      </w:r>
-      <w:r>
         <w:rPr>
           <w:noProof/>
         </w:rPr>
         <w:t>December 31, 2026</w:t>
-      </w:r>
-      <w:r>
-        <w:fldChar w:fldCharType="end"/>
       </w:r>
       <w:r>
         <w:t>:</w:t>
@@ -1275,31 +1074,10 @@
         <w:t xml:space="preserve">Services performed by </w:t>
       </w:r>
       <w:r>
-        <w:fldChar w:fldCharType="begin">
-          <w:ffData>
-            <w:name w:val=""/>
-            <w:enabled/>
-            <w:calcOnExit w:val="0"/>
-            <w:textInput>
-              <w:default w:val="CFO"/>
-            </w:textInput>
-          </w:ffData>
-        </w:fldChar>
-      </w:r>
-      <w:r>
-        <w:instrText xml:space="preserve"> FORMTEXT </w:instrText>
-      </w:r>
-      <w:r>
-        <w:fldChar w:fldCharType="separate"/>
-      </w:r>
-      <w:r>
         <w:rPr>
           <w:noProof/>
         </w:rPr>
         <w:t>CFO</w:t>
-      </w:r>
-      <w:r>
-        <w:fldChar w:fldCharType="end"/>
       </w:r>
       <w:r>
         <w:rPr/>
@@ -1731,31 +1509,10 @@
         <w:t xml:space="preserve">with the </w:t>
       </w:r>
       <w:r>
-        <w:fldChar w:fldCharType="begin">
-          <w:ffData>
-            <w:name w:val=""/>
-            <w:enabled/>
-            <w:calcOnExit w:val="0"/>
-            <w:textInput>
-              <w:default w:val="[identify the work product]"/>
-            </w:textInput>
-          </w:ffData>
-        </w:fldChar>
-      </w:r>
-      <w:r>
-        <w:instrText xml:space="preserve"> FORMTEXT </w:instrText>
-      </w:r>
-      <w:r>
-        <w:fldChar w:fldCharType="separate"/>
-      </w:r>
-      <w:r>
         <w:rPr>
           <w:noProof/>
         </w:rPr>
         <w:t>the books and supporting schedules</w:t>
-      </w:r>
-      <w:r>
-        <w:fldChar w:fldCharType="end"/>
       </w:r>
       <w:r>
         <w:t xml:space="preserve">. </w:t>
@@ -1863,45 +1620,12 @@
           <w:b/>
           <w:i/>
         </w:rPr>
-        <w:fldChar w:fldCharType="begin">
-          <w:ffData>
-            <w:name w:val=""/>
-            <w:enabled/>
-            <w:calcOnExit w:val="0"/>
-            <w:textInput>
-              <w:default w:val="[insert amount]"/>
-            </w:textInput>
-          </w:ffData>
-        </w:fldChar>
-      </w:r>
-      <w:r>
-        <w:instrText xml:space="preserve"> FORMTEXT </w:instrText>
-      </w:r>
-      <w:r>
-        <w:rPr>
-          <w:b/>
-          <w:i/>
-        </w:rPr>
-      </w:r>
-      <w:r>
-        <w:rPr>
-          <w:b/>
-          <w:i/>
-        </w:rPr>
-        <w:fldChar w:fldCharType="separate"/>
       </w:r>
       <w:r>
         <w:rPr>
           <w:noProof/>
         </w:rPr>
         <w:t>[insert amount]</w:t>
-      </w:r>
-      <w:r>
-        <w:rPr>
-          <w:b/>
-          <w:i/>
-        </w:rPr>
-        <w:fldChar w:fldCharType="end"/>
       </w:r>
       <w:r>
         <w:rPr>

</xml_diff>

<commit_message>
Remove retainer section from Lucero letter
No retainer for this engagement. Removed the Retainer heading and
paragraph; fee section now flows from billing disputes to Other fees.
Letter has no remaining placeholders.

Co-Authored-By: Claude Opus 4.8 <noreply@anthropic.com>
Claude-Session: https://claude.ai/code/session_01RfN2m1kgBo1xCWLXRNw2zV
</commit_message>
<xml_diff>
--- a/Onyx_Engagement_Letter_Lucero_HOURLY.docx
+++ b/Onyx_Engagement_Letter_Lucero_HOURLY.docx
@@ -1574,137 +1574,6 @@
       <w:proofErr w:type="gramEnd"/>
       <w:r>
         <w:t xml:space="preserve"> its itemized charges and costs, acceptable and reasonable.</w:t>
-      </w:r>
-    </w:p>
-    <w:p>
-      <w:pPr>
-        <w:pStyle w:val="CLALTRHeading2"/>
-        <w:jc w:val="both"/>
-      </w:pPr>
-      <w:r>
-        <w:rPr/>
-        <w:t>Retainer</w:t>
-      </w:r>
-    </w:p>
-    <w:p>
-      <w:pPr>
-        <w:pStyle w:val="CLALTRNormal"/>
-        <w:jc w:val="both"/>
-      </w:pPr>
-      <w:r>
-        <w:rPr/>
-        <w:t xml:space="preserve">In connection with this engagement, </w:t>
-      </w:r>
-      <w:r>
-        <w:rPr/>
-        <w:t>ONYX</w:t>
-      </w:r>
-      <w:r>
-        <w:rPr/>
-        <w:t xml:space="preserve"> </w:t>
-      </w:r>
-      <w:r>
-        <w:rPr/>
-        <w:t>must receive a retainer in the initial amount of</w:t>
-      </w:r>
-      <w:r>
-        <w:rPr/>
-        <w:t xml:space="preserve"> </w:t>
-      </w:r>
-      <w:r>
-        <w:rPr/>
-        <w:t>$</w:t>
-      </w:r>
-      <w:r>
-        <w:rPr>
-          <w:b/>
-          <w:i/>
-        </w:rPr>
-      </w:r>
-      <w:r>
-        <w:rPr>
-          <w:noProof/>
-        </w:rPr>
-        <w:t>[insert amount]</w:t>
-      </w:r>
-      <w:r>
-        <w:rPr>
-          <w:bCs/>
-          <w:iCs/>
-        </w:rPr>
-        <w:t xml:space="preserve"> (the “Retainer”)</w:t>
-      </w:r>
-      <w:r>
-        <w:rPr/>
-        <w:t>, payable prior to the commencement of any services.</w:t>
-      </w:r>
-      <w:r>
-        <w:rPr/>
-        <w:t xml:space="preserve"> </w:t>
-      </w:r>
-      <w:r>
-        <w:rPr/>
-        <w:t xml:space="preserve">The Client expressly grants ONYX a possessory security interest </w:t>
-      </w:r>
-      <w:r>
-        <w:rPr/>
-        <w:t>in the</w:t>
-      </w:r>
-      <w:r>
-        <w:rPr/>
-        <w:t xml:space="preserve"> Retainer</w:t>
-      </w:r>
-      <w:r>
-        <w:rPr/>
-        <w:t xml:space="preserve"> to secure the payment of ONYX’s fees and costs. The Client also authorizes ONYX to withdraw from the Retainer any sums necessary to </w:t>
-      </w:r>
-      <w:r>
-        <w:rPr/>
-        <w:t>pay fees charged, and costs incurred, from ONYX’s engagement.</w:t>
-      </w:r>
-      <w:r>
-        <w:rPr/>
-        <w:t xml:space="preserve"> </w:t>
-      </w:r>
-      <w:r>
-        <w:rPr/>
-        <w:t>T</w:t>
-      </w:r>
-      <w:r>
-        <w:rPr/>
-        <w:t xml:space="preserve">he </w:t>
-      </w:r>
-      <w:r>
-        <w:rPr/>
-        <w:t>R</w:t>
-      </w:r>
-      <w:r>
-        <w:rPr/>
-        <w:t xml:space="preserve">etainer will be applied to </w:t>
-      </w:r>
-      <w:r>
-        <w:rPr/>
-        <w:t>ONYX’s</w:t>
-      </w:r>
-      <w:r>
-        <w:rPr/>
-        <w:t xml:space="preserve"> </w:t>
-      </w:r>
-      <w:r>
-        <w:rPr/>
-        <w:t>final invoice</w:t>
-      </w:r>
-      <w:r>
-        <w:rPr/>
-        <w:t>. The Client must also still pay any remaining balance due to ONYX</w:t>
-      </w:r>
-      <w:r>
-        <w:rPr/>
-        <w:t xml:space="preserve"> after the Retainer is applied to the final invoice. We will refund to the Client any unearned balance remaining from the Retainer when we conclude our engagement</w:t>
-      </w:r>
-      <w:r>
-        <w:rPr/>
-        <w:t>.</w:t>
       </w:r>
     </w:p>
     <w:p>

</xml_diff>